<commit_message>
Raise Developer tier to 300 pooled analyses per month.
Better proportion vs Professional (75 at €149) and updates pricing card plus billing docs.

Co-authored-by: Cursor <cursoragent@cursor.com>
</commit_message>
<xml_diff>
--- a/docs/PVMath_Pilot_Subscription_Agreement.docx
+++ b/docs/PVMath_Pilot_Subscription_Agreement.docx
@@ -100,7 +100,7 @@
         <w:pStyle w:val="ListBullet"/>
       </w:pPr>
       <w:r>
-        <w:t>Developer: 150 analyses per calendar month, shared team pool (up to 5 seats).</w:t>
+        <w:t>Developer: 300 analyses per calendar month, shared team pool (up to 5 seats).</w:t>
       </w:r>
     </w:p>
     <w:p>
@@ -318,7 +318,7 @@
     </w:p>
     <w:p>
       <w:r>
-        <w:t>Pilot-Zugang zu PVMath (SiteIQ, TopoIQ, YieldIQ). Screening-Qualität, keine Bankfähigkeit. Professional: 75 Analysen/Monat gesamt. Developer: 150/Monat Team-Pool. Freischaltung nach Zahlungseingang. Bei UG-Gründung nahtlose Fortführung.</w:t>
+        <w:t>Pilot-Zugang zu PVMath (SiteIQ, TopoIQ, YieldIQ). Screening-Qualität, keine Bankfähigkeit. Professional: 75 Analysen/Monat gesamt. Developer: 300/Monat Team-Pool. Freischaltung nach Zahlungseingang. Bei UG-Gründung nahtlose Fortführung.</w:t>
       </w:r>
     </w:p>
     <w:sectPr>

</xml_diff>